<commit_message>
Fix template: add variables
</commit_message>
<xml_diff>
--- a/contract_template.docx
+++ b/contract_template.docx
@@ -11,8 +11,6 @@
           <w:szCs w:val="28"/>
         </w:rPr>
       </w:pPr>
-      <w:bookmarkStart w:id="0" w:name="_GoBack"/>
-      <w:bookmarkEnd w:id="0"/>
       <w:r>
         <w:rPr>
           <w:b/>
@@ -77,34 +75,59 @@
         <w:jc w:val="center"/>
       </w:pPr>
       <w:r>
-        <w:t>от «_</w:t>
-      </w:r>
-      <w:r>
-        <w:t>_</w:t>
-      </w:r>
-      <w:r>
-        <w:t>__</w:t>
-      </w:r>
-      <w:r>
-        <w:t>_»</w:t>
-      </w:r>
-      <w:r>
-        <w:t xml:space="preserve"> ___________________ 20</w:t>
-      </w:r>
-      <w:r>
-        <w:t>25</w:t>
-      </w:r>
-      <w:r>
-        <w:t xml:space="preserve"> г.</w:t>
-      </w:r>
-    </w:p>
-    <w:p/>
-    <w:p>
-      <w:r>
-        <w:t>____________</w:t>
-      </w:r>
-      <w:r>
-        <w:t>___________________________</w:t>
+        <w:rPr>
+          <w:rFonts w:ascii="Segoe UI" w:hAnsi="Segoe UI" w:cs="Segoe UI"/>
+          <w:color w:val="0F1115"/>
+          <w:sz w:val="23"/>
+          <w:szCs w:val="23"/>
+          <w:shd w:val="clear" w:color="auto" w:fill="FFFFFF"/>
+        </w:rPr>
+        <w:t xml:space="preserve">от </w:t>
+      </w:r>
+      <w:r>
+        <w:t>«{</w:t>
+      </w:r>
+      <w:proofErr w:type="spellStart"/>
+      <w:r>
+        <w:t>current_date</w:t>
+      </w:r>
+      <w:proofErr w:type="spellEnd"/>
+      <w:r>
+        <w:t>}» г.</w:t>
+      </w:r>
+    </w:p>
+    <w:p>
+      <w:r>
+        <w:rPr>
+          <w:rFonts w:ascii="Segoe UI" w:hAnsi="Segoe UI" w:cs="Segoe UI"/>
+          <w:color w:val="0F1115"/>
+          <w:sz w:val="23"/>
+          <w:szCs w:val="23"/>
+          <w:shd w:val="clear" w:color="auto" w:fill="FFFFFF"/>
+        </w:rPr>
+        <w:t>{</w:t>
+      </w:r>
+      <w:proofErr w:type="spellStart"/>
+      <w:r>
+        <w:rPr>
+          <w:rFonts w:ascii="Segoe UI" w:hAnsi="Segoe UI" w:cs="Segoe UI"/>
+          <w:color w:val="0F1115"/>
+          <w:sz w:val="23"/>
+          <w:szCs w:val="23"/>
+          <w:shd w:val="clear" w:color="auto" w:fill="FFFFFF"/>
+        </w:rPr>
+        <w:t>full_name</w:t>
+      </w:r>
+      <w:proofErr w:type="spellEnd"/>
+      <w:r>
+        <w:rPr>
+          <w:rFonts w:ascii="Segoe UI" w:hAnsi="Segoe UI" w:cs="Segoe UI"/>
+          <w:color w:val="0F1115"/>
+          <w:sz w:val="23"/>
+          <w:szCs w:val="23"/>
+          <w:shd w:val="clear" w:color="auto" w:fill="FFFFFF"/>
+        </w:rPr>
+        <w:t>}</w:t>
       </w:r>
       <w:r>
         <w:t xml:space="preserve"> именуемый в дальнейшем «</w:t>
@@ -177,20 +200,52 @@
       <w:r>
         <w:t xml:space="preserve">        </w:t>
       </w:r>
-      <w:r>
-        <w:t>мкр-н ________________</w:t>
-      </w:r>
-      <w:r>
-        <w:t>_,</w:t>
-      </w:r>
-      <w:r>
-        <w:t xml:space="preserve"> дом № _______________</w:t>
-      </w:r>
-      <w:r>
-        <w:t>_,</w:t>
-      </w:r>
-      <w:r>
-        <w:t xml:space="preserve"> кв. № _____________</w:t>
+      <w:proofErr w:type="spellStart"/>
+      <w:r>
+        <w:t>мкр</w:t>
+      </w:r>
+      <w:proofErr w:type="spellEnd"/>
+      <w:r>
+        <w:t>-н {</w:t>
+      </w:r>
+      <w:proofErr w:type="spellStart"/>
+      <w:r>
+        <w:t>microdistrict</w:t>
+      </w:r>
+      <w:proofErr w:type="spellEnd"/>
+      <w:r>
+        <w:t>}</w:t>
+      </w:r>
+      <w:r>
+        <w:t>,</w:t>
+      </w:r>
+      <w:r>
+        <w:t xml:space="preserve"> </w:t>
+      </w:r>
+      <w:r>
+        <w:t>дом № {</w:t>
+      </w:r>
+      <w:proofErr w:type="spellStart"/>
+      <w:r>
+        <w:t>house</w:t>
+      </w:r>
+      <w:proofErr w:type="spellEnd"/>
+      <w:r>
+        <w:t>}</w:t>
+      </w:r>
+      <w:r>
+        <w:t xml:space="preserve">, </w:t>
+      </w:r>
+      <w:r>
+        <w:t>кв. № {</w:t>
+      </w:r>
+      <w:proofErr w:type="spellStart"/>
+      <w:r>
+        <w:t>apartment</w:t>
+      </w:r>
+      <w:proofErr w:type="spellEnd"/>
+      <w:r>
+        <w:t>}</w:t>
       </w:r>
     </w:p>
     <w:p>
@@ -278,22 +333,52 @@
     </w:p>
     <w:p>
       <w:r>
-        <w:t xml:space="preserve">2.1. Договор на обслуживание системы ПЗУ заключается на срок с </w:t>
-      </w:r>
-      <w:r>
-        <w:t>«__»</w:t>
-      </w:r>
-      <w:r>
-        <w:t xml:space="preserve"> </w:t>
-      </w:r>
-      <w:r>
-        <w:t>___________ 202</w:t>
-      </w:r>
-      <w:r>
-        <w:t>__</w:t>
-      </w:r>
-      <w:r>
-        <w:t xml:space="preserve"> г.</w:t>
+        <w:t xml:space="preserve">2.1. Договор на обслуживание системы ПЗУ заключается на срок </w:t>
+      </w:r>
+      <w:r>
+        <w:rPr>
+          <w:rFonts w:ascii="Segoe UI" w:hAnsi="Segoe UI" w:cs="Segoe UI"/>
+          <w:color w:val="0F1115"/>
+          <w:sz w:val="23"/>
+          <w:szCs w:val="23"/>
+          <w:shd w:val="clear" w:color="auto" w:fill="FFFFFF"/>
+        </w:rPr>
+        <w:t>с «{</w:t>
+      </w:r>
+      <w:proofErr w:type="spellStart"/>
+      <w:r>
+        <w:rPr>
+          <w:rFonts w:ascii="Segoe UI" w:hAnsi="Segoe UI" w:cs="Segoe UI"/>
+          <w:color w:val="0F1115"/>
+          <w:sz w:val="23"/>
+          <w:szCs w:val="23"/>
+          <w:shd w:val="clear" w:color="auto" w:fill="FFFFFF"/>
+        </w:rPr>
+        <w:t>start_date</w:t>
+      </w:r>
+      <w:proofErr w:type="spellEnd"/>
+      <w:r>
+        <w:rPr>
+          <w:rFonts w:ascii="Segoe UI" w:hAnsi="Segoe UI" w:cs="Segoe UI"/>
+          <w:color w:val="0F1115"/>
+          <w:sz w:val="23"/>
+          <w:szCs w:val="23"/>
+          <w:shd w:val="clear" w:color="auto" w:fill="FFFFFF"/>
+        </w:rPr>
+        <w:t xml:space="preserve">}» </w:t>
+      </w:r>
+      <w:r>
+        <w:rPr>
+          <w:rFonts w:ascii="Segoe UI" w:hAnsi="Segoe UI" w:cs="Segoe UI"/>
+          <w:color w:val="0F1115"/>
+          <w:sz w:val="23"/>
+          <w:szCs w:val="23"/>
+          <w:shd w:val="clear" w:color="auto" w:fill="FFFFFF"/>
+        </w:rPr>
+        <w:t>г</w:t>
+      </w:r>
+      <w:r>
+        <w:t>.</w:t>
       </w:r>
       <w:r>
         <w:t xml:space="preserve">               </w:t>
@@ -304,19 +389,36 @@
         <w:t xml:space="preserve">       </w:t>
       </w:r>
       <w:r>
-        <w:t xml:space="preserve">по </w:t>
-      </w:r>
-      <w:r>
-        <w:t>«__»</w:t>
-      </w:r>
-      <w:r>
-        <w:t xml:space="preserve"> ____________ 20</w:t>
-      </w:r>
-      <w:r>
-        <w:t>2</w:t>
-      </w:r>
-      <w:r>
-        <w:t>__ г.</w:t>
+        <w:rPr>
+          <w:rFonts w:ascii="Segoe UI" w:hAnsi="Segoe UI" w:cs="Segoe UI"/>
+          <w:color w:val="0F1115"/>
+          <w:sz w:val="23"/>
+          <w:szCs w:val="23"/>
+          <w:shd w:val="clear" w:color="auto" w:fill="FFFFFF"/>
+        </w:rPr>
+        <w:t>по «{</w:t>
+      </w:r>
+      <w:proofErr w:type="spellStart"/>
+      <w:r>
+        <w:rPr>
+          <w:rFonts w:ascii="Segoe UI" w:hAnsi="Segoe UI" w:cs="Segoe UI"/>
+          <w:color w:val="0F1115"/>
+          <w:sz w:val="23"/>
+          <w:szCs w:val="23"/>
+          <w:shd w:val="clear" w:color="auto" w:fill="FFFFFF"/>
+        </w:rPr>
+        <w:t>end_date</w:t>
+      </w:r>
+      <w:proofErr w:type="spellEnd"/>
+      <w:r>
+        <w:rPr>
+          <w:rFonts w:ascii="Segoe UI" w:hAnsi="Segoe UI" w:cs="Segoe UI"/>
+          <w:color w:val="0F1115"/>
+          <w:sz w:val="23"/>
+          <w:szCs w:val="23"/>
+          <w:shd w:val="clear" w:color="auto" w:fill="FFFFFF"/>
+        </w:rPr>
+        <w:t>}» г.</w:t>
       </w:r>
     </w:p>
     <w:p>
@@ -393,39 +495,130 @@
       </w:r>
       <w:r>
         <w:rPr>
+          <w:rFonts w:ascii="Segoe UI" w:hAnsi="Segoe UI" w:cs="Segoe UI"/>
+          <w:color w:val="0F1115"/>
+          <w:sz w:val="23"/>
+          <w:szCs w:val="23"/>
+          <w:shd w:val="clear" w:color="auto" w:fill="FFFFFF"/>
+        </w:rPr>
+        <w:t>{</w:t>
+      </w:r>
+      <w:proofErr w:type="spellStart"/>
+      <w:r>
+        <w:rPr>
+          <w:rFonts w:ascii="Segoe UI" w:hAnsi="Segoe UI" w:cs="Segoe UI"/>
+          <w:color w:val="0F1115"/>
+          <w:sz w:val="23"/>
+          <w:szCs w:val="23"/>
+          <w:shd w:val="clear" w:color="auto" w:fill="FFFFFF"/>
+        </w:rPr>
+        <w:t>amount</w:t>
+      </w:r>
+      <w:proofErr w:type="spellEnd"/>
+      <w:r>
+        <w:rPr>
+          <w:rFonts w:ascii="Segoe UI" w:hAnsi="Segoe UI" w:cs="Segoe UI"/>
+          <w:color w:val="0F1115"/>
+          <w:sz w:val="23"/>
+          <w:szCs w:val="23"/>
+          <w:shd w:val="clear" w:color="auto" w:fill="FFFFFF"/>
+        </w:rPr>
+        <w:t>}</w:t>
+      </w:r>
+      <w:r>
+        <w:rPr>
           <w:u w:val="single"/>
         </w:rPr>
-        <w:t>4</w:t>
+        <w:t xml:space="preserve"> </w:t>
+      </w:r>
+      <w:r>
+        <w:rPr>
+          <w:rFonts w:ascii="Segoe UI" w:hAnsi="Segoe UI" w:cs="Segoe UI"/>
+          <w:color w:val="0F1115"/>
+          <w:sz w:val="23"/>
+          <w:szCs w:val="23"/>
+          <w:shd w:val="clear" w:color="auto" w:fill="FFFFFF"/>
+        </w:rPr>
+        <w:t>{</w:t>
+      </w:r>
+      <w:proofErr w:type="spellStart"/>
+      <w:r>
+        <w:rPr>
+          <w:rFonts w:ascii="Segoe UI" w:hAnsi="Segoe UI" w:cs="Segoe UI"/>
+          <w:color w:val="0F1115"/>
+          <w:sz w:val="23"/>
+          <w:szCs w:val="23"/>
+          <w:shd w:val="clear" w:color="auto" w:fill="FFFFFF"/>
+        </w:rPr>
+        <w:t>amount_text</w:t>
+      </w:r>
+      <w:proofErr w:type="spellEnd"/>
+      <w:r>
+        <w:rPr>
+          <w:rFonts w:ascii="Segoe UI" w:hAnsi="Segoe UI" w:cs="Segoe UI"/>
+          <w:color w:val="0F1115"/>
+          <w:sz w:val="23"/>
+          <w:szCs w:val="23"/>
+          <w:shd w:val="clear" w:color="auto" w:fill="FFFFFF"/>
+        </w:rPr>
+        <w:t>}</w:t>
+      </w:r>
+      <w:r>
+        <w:rPr>
+          <w:rFonts w:ascii="Segoe UI" w:hAnsi="Segoe UI" w:cs="Segoe UI"/>
+          <w:color w:val="0F1115"/>
+          <w:sz w:val="23"/>
+          <w:szCs w:val="23"/>
+          <w:shd w:val="clear" w:color="auto" w:fill="FFFFFF"/>
+        </w:rPr>
+        <w:t xml:space="preserve"> </w:t>
       </w:r>
       <w:r>
         <w:rPr>
           <w:u w:val="single"/>
         </w:rPr>
-        <w:t>8</w:t>
+        <w:t>рублей</w:t>
       </w:r>
       <w:r>
         <w:rPr>
           <w:u w:val="single"/>
         </w:rPr>
-        <w:t>0</w:t>
+        <w:t xml:space="preserve"> 00 коп</w:t>
       </w:r>
       <w:r>
         <w:rPr>
           <w:u w:val="single"/>
         </w:rPr>
-        <w:t xml:space="preserve"> (</w:t>
+        <w:t xml:space="preserve"> в </w:t>
       </w:r>
       <w:r>
         <w:rPr>
           <w:u w:val="single"/>
         </w:rPr>
-        <w:t>четыреста восемьдесят)</w:t>
+        <w:t>год.</w:t>
+      </w:r>
+    </w:p>
+    <w:p>
+      <w:r>
+        <w:t xml:space="preserve">3.2 Плата за монтаж </w:t>
+      </w:r>
+      <w:r>
+        <w:t>абонентского устройства (АУ)</w:t>
+      </w:r>
+      <w:r>
+        <w:t xml:space="preserve"> составляет с одной квартиры</w:t>
+      </w:r>
+      <w:r>
+        <w:t>,</w:t>
+      </w:r>
+      <w:r>
+        <w:t xml:space="preserve"> </w:t>
       </w:r>
       <w:r>
         <w:rPr>
           <w:u w:val="single"/>
         </w:rPr>
-        <w:t xml:space="preserve"> рублей</w:t>
+        <w:t>3000 (три тысячи) рублей</w:t>
       </w:r>
       <w:r>
         <w:rPr>
@@ -434,210 +627,169 @@
         <w:t xml:space="preserve"> 00 коп</w:t>
       </w:r>
       <w:r>
-        <w:rPr>
-          <w:u w:val="single"/>
-        </w:rPr>
-        <w:t xml:space="preserve"> в </w:t>
-      </w:r>
-      <w:r>
-        <w:rPr>
-          <w:u w:val="single"/>
-        </w:rPr>
-        <w:t>год.</w:t>
-      </w:r>
-    </w:p>
-    <w:p>
-      <w:r>
-        <w:t xml:space="preserve">3.2 Плата за монтаж </w:t>
-      </w:r>
-      <w:r>
-        <w:t>абонентского устройства (АУ)</w:t>
-      </w:r>
-      <w:r>
-        <w:t xml:space="preserve"> составляет с одной квартиры</w:t>
-      </w:r>
-      <w:r>
-        <w:t>,</w:t>
+        <w:t>.</w:t>
+      </w:r>
+    </w:p>
+    <w:p>
+      <w:r>
+        <w:t>3.</w:t>
+      </w:r>
+      <w:r>
+        <w:t>3</w:t>
+      </w:r>
+      <w:r>
+        <w:t xml:space="preserve">. Плата за обслуживание может изменяться в зависимости от уровня инфляции, о чем </w:t>
+      </w:r>
+    </w:p>
+    <w:p>
+      <w:r>
+        <w:t xml:space="preserve">       </w:t>
+      </w:r>
+      <w:r>
+        <w:t>«Заказчик» должен быть предупрежден не менее чем за один месяц.</w:t>
+      </w:r>
+    </w:p>
+    <w:p>
+      <w:r>
+        <w:t>3.4.</w:t>
+      </w:r>
+      <w:r>
+        <w:t xml:space="preserve"> Исполнитель применяет упрощённую систему налогообложения, поэтому стоимость работ, указанная в пункте</w:t>
+      </w:r>
+      <w:r>
+        <w:t xml:space="preserve"> 3.1</w:t>
+      </w:r>
+      <w:r>
+        <w:t xml:space="preserve"> настоящего Договора, НДС не облагается на основании п. 2 ст. 346.11 Налогового кодекса Р</w:t>
+      </w:r>
+      <w:r>
+        <w:t>Ф.</w:t>
+      </w:r>
+    </w:p>
+    <w:p>
+      <w:r>
+        <w:t>3.5 В</w:t>
+      </w:r>
+      <w:r>
+        <w:t xml:space="preserve"> случае изменения системы налогообложения Исполнителя и возникновения у него обязанности по уплате НДС, стоимость работ (услуг) по настоящему Договору увеличивается на сумму НДС в соответствии с законодательством РФ. Увеличение цены происходит с момента, когда Исполнитель стал плательщиком НДС</w:t>
+      </w:r>
+      <w:r>
+        <w:t>.</w:t>
+      </w:r>
+    </w:p>
+    <w:p/>
+    <w:p>
+      <w:r>
+        <w:t xml:space="preserve">       </w:t>
+      </w:r>
+    </w:p>
+    <w:p>
+      <w:pPr>
+        <w:jc w:val="center"/>
+        <w:rPr>
+          <w:b/>
+        </w:rPr>
+      </w:pPr>
+      <w:r>
+        <w:rPr>
+          <w:b/>
+        </w:rPr>
+        <w:t>4. Права и обязанности сторон.</w:t>
+      </w:r>
+    </w:p>
+    <w:p>
+      <w:r>
+        <w:t>4.1. «Заказчик» обяз</w:t>
+      </w:r>
+      <w:r>
+        <w:t>уется</w:t>
       </w:r>
       <w:r>
         <w:t xml:space="preserve"> </w:t>
       </w:r>
       <w:r>
-        <w:rPr>
-          <w:u w:val="single"/>
-        </w:rPr>
-        <w:t>3000 (три тысячи) рублей</w:t>
-      </w:r>
-      <w:r>
-        <w:rPr>
-          <w:u w:val="single"/>
-        </w:rPr>
-        <w:t xml:space="preserve"> 00 коп</w:t>
+        <w:t xml:space="preserve">оплатить услуги по обслуживанию ПЗУ </w:t>
+      </w:r>
+      <w:r>
+        <w:t xml:space="preserve">авансом </w:t>
+      </w:r>
+      <w:r>
+        <w:t>раз в год</w:t>
       </w:r>
       <w:r>
         <w:t>.</w:t>
       </w:r>
-    </w:p>
-    <w:p>
-      <w:r>
-        <w:t>3.</w:t>
+      <w:r>
+        <w:t xml:space="preserve">  </w:t>
+      </w:r>
+    </w:p>
+    <w:p>
+      <w:r>
+        <w:t>4.2. «Заказчик» обязан обеспечить доступ в места проведения работ.</w:t>
+      </w:r>
+    </w:p>
+    <w:p>
+      <w:r>
+        <w:t xml:space="preserve">4.3. «Исполнитель» обязуется выполнять заявки по ремонту в течение 3-х дней, не считая дня   </w:t>
+      </w:r>
+    </w:p>
+    <w:p>
+      <w:r>
+        <w:t xml:space="preserve">        подачи заявки, </w:t>
+      </w:r>
+      <w:r>
+        <w:t>общевыходных и праздничных дней</w:t>
+      </w:r>
+      <w:r>
+        <w:t xml:space="preserve">. </w:t>
+      </w:r>
+      <w:r>
+        <w:t>Работы,</w:t>
+      </w:r>
+      <w:r>
+        <w:t xml:space="preserve"> требующие ремонта и  </w:t>
+      </w:r>
+    </w:p>
+    <w:p>
+      <w:r>
+        <w:t xml:space="preserve">        обслуживания оборудования на открытом воздухе, при температуре ниже -25° С  </w:t>
+      </w:r>
+    </w:p>
+    <w:p>
+      <w:r>
+        <w:t xml:space="preserve">        </w:t>
+      </w:r>
+      <w:r>
+        <w:t>приостанавливаются до</w:t>
+      </w:r>
+      <w:r>
+        <w:t xml:space="preserve"> ее повышения.  </w:t>
+      </w:r>
+      <w:r>
+        <w:t xml:space="preserve">Заявки принимаются </w:t>
+      </w:r>
+      <w:r>
+        <w:t>диспетчером по</w:t>
+      </w:r>
+      <w:r>
+        <w:t xml:space="preserve"> тел. </w:t>
+      </w:r>
+      <w:r>
+        <w:t>(346</w:t>
       </w:r>
       <w:r>
         <w:t>3</w:t>
       </w:r>
       <w:r>
-        <w:t xml:space="preserve">. Плата за обслуживание может изменяться в зависимости от уровня инфляции, о чем </w:t>
-      </w:r>
-    </w:p>
-    <w:p>
-      <w:r>
-        <w:t xml:space="preserve">       </w:t>
-      </w:r>
-      <w:r>
-        <w:t>«Заказчик» должен быть предупрежден не менее чем за один месяц.</w:t>
-      </w:r>
-    </w:p>
-    <w:p>
-      <w:r>
-        <w:t>3.4.</w:t>
-      </w:r>
-      <w:r>
-        <w:t xml:space="preserve"> Исполнитель применяет упрощённую систему налогообложения, поэтому стоимость работ, указанная в пункте</w:t>
-      </w:r>
-      <w:r>
-        <w:t xml:space="preserve"> 3.1</w:t>
-      </w:r>
-      <w:r>
-        <w:t xml:space="preserve"> настоящего Договора, НДС не облагается на основании п. 2 ст. 346.11 Налогового кодекса Р</w:t>
-      </w:r>
-      <w:r>
-        <w:t>Ф.</w:t>
-      </w:r>
-    </w:p>
-    <w:p>
-      <w:r>
-        <w:t>3.5 В</w:t>
-      </w:r>
-      <w:r>
-        <w:t xml:space="preserve"> случае изменения системы налогообложения Исполнителя и возникновения у него обязанности по уплате НДС, стоимость работ (услуг) по настоящему Договору увеличивается на сумму НДС в соответствии с законодательством РФ. Увеличение цены происходит с момента, когда Исполнитель стал плательщиком НДС</w:t>
-      </w:r>
-      <w:r>
-        <w:t>.</w:t>
-      </w:r>
-    </w:p>
-    <w:p/>
-    <w:p>
-      <w:r>
-        <w:t xml:space="preserve">       </w:t>
-      </w:r>
-    </w:p>
-    <w:p>
-      <w:pPr>
-        <w:jc w:val="center"/>
-        <w:rPr>
-          <w:b/>
-        </w:rPr>
-      </w:pPr>
-      <w:r>
-        <w:rPr>
-          <w:b/>
-        </w:rPr>
-        <w:t>4. Права и обязанности сторон.</w:t>
-      </w:r>
-    </w:p>
-    <w:p>
-      <w:r>
-        <w:t>4.1. «Заказчик» обяз</w:t>
-      </w:r>
-      <w:r>
-        <w:t>уется</w:t>
+        <w:t>)200-800</w:t>
+      </w:r>
+      <w:r>
+        <w:t xml:space="preserve"> и по адресу 2 мкр. 2 дом</w:t>
       </w:r>
       <w:r>
         <w:t xml:space="preserve"> </w:t>
       </w:r>
       <w:r>
-        <w:t xml:space="preserve">оплатить услуги по обслуживанию ПЗУ </w:t>
-      </w:r>
-      <w:r>
-        <w:t xml:space="preserve">авансом </w:t>
-      </w:r>
-      <w:r>
-        <w:t>раз в год</w:t>
-      </w:r>
-      <w:r>
-        <w:t>.</w:t>
-      </w:r>
-      <w:r>
-        <w:t xml:space="preserve">  </w:t>
-      </w:r>
-    </w:p>
-    <w:p>
-      <w:r>
-        <w:t>4.2. «Заказчик» обязан обеспечить доступ в места проведения работ.</w:t>
-      </w:r>
-    </w:p>
-    <w:p>
-      <w:r>
-        <w:t xml:space="preserve">4.3. «Исполнитель» обязуется выполнять заявки по ремонту в течение 3-х дней, не считая дня   </w:t>
-      </w:r>
-    </w:p>
-    <w:p>
-      <w:r>
-        <w:t xml:space="preserve">        подачи заявки, </w:t>
-      </w:r>
-      <w:r>
-        <w:t>общевыходных и праздничных дней</w:t>
-      </w:r>
-      <w:r>
-        <w:t xml:space="preserve">. </w:t>
-      </w:r>
-      <w:r>
-        <w:t>Работы,</w:t>
-      </w:r>
-      <w:r>
-        <w:t xml:space="preserve"> требующие ремонта и  </w:t>
-      </w:r>
-    </w:p>
-    <w:p>
-      <w:r>
-        <w:t xml:space="preserve">        обслуживания оборудования на открытом воздухе, при температуре ниже -25° С  </w:t>
-      </w:r>
-    </w:p>
-    <w:p>
-      <w:r>
-        <w:t xml:space="preserve">        </w:t>
-      </w:r>
-      <w:r>
-        <w:t>приостанавливаются до</w:t>
-      </w:r>
-      <w:r>
-        <w:t xml:space="preserve"> ее повышения.  </w:t>
-      </w:r>
-      <w:r>
-        <w:t xml:space="preserve">Заявки принимаются </w:t>
-      </w:r>
-      <w:r>
-        <w:t>диспетчером по</w:t>
-      </w:r>
-      <w:r>
-        <w:t xml:space="preserve"> тел. </w:t>
-      </w:r>
-      <w:r>
-        <w:t>(346</w:t>
-      </w:r>
-      <w:r>
-        <w:t>3</w:t>
-      </w:r>
-      <w:r>
-        <w:t>)200-800</w:t>
-      </w:r>
-      <w:r>
-        <w:t xml:space="preserve"> и по адресу 2 мкр. 2 дом</w:t>
-      </w:r>
-      <w:r>
-        <w:t xml:space="preserve"> </w:t>
-      </w:r>
-      <w:r>
         <w:t xml:space="preserve">с </w:t>
       </w:r>
       <w:r>
@@ -686,21 +838,21 @@
     </w:p>
     <w:p>
       <w:r>
+        <w:t xml:space="preserve">         </w:t>
+      </w:r>
+      <w:r>
+        <w:t xml:space="preserve">за обслуживание ПЗУ в течение </w:t>
+      </w:r>
+      <w:r>
+        <w:t>7 рабочих дней</w:t>
+      </w:r>
+      <w:r>
+        <w:t xml:space="preserve">. Повторное подключение производится </w:t>
+      </w:r>
+    </w:p>
+    <w:p>
+      <w:r>
         <w:lastRenderedPageBreak/>
-        <w:t xml:space="preserve">         </w:t>
-      </w:r>
-      <w:r>
-        <w:t xml:space="preserve">за обслуживание ПЗУ в течение </w:t>
-      </w:r>
-      <w:r>
-        <w:t>7 рабочих дней</w:t>
-      </w:r>
-      <w:r>
-        <w:t xml:space="preserve">. Повторное подключение производится </w:t>
-      </w:r>
-    </w:p>
-    <w:p>
-      <w:r>
         <w:t xml:space="preserve">         </w:t>
       </w:r>
       <w:r>
@@ -1165,21 +1317,32 @@
             </w:r>
           </w:p>
           <w:p>
-            <w:r>
-              <w:t>Тел.: (3463) 200-800</w:t>
+            <w:pPr>
+              <w:rPr>
+                <w:lang w:val="en-US"/>
+              </w:rPr>
+            </w:pPr>
+            <w:r>
+              <w:t>Тел</w:t>
+            </w:r>
+            <w:r>
+              <w:rPr>
+                <w:lang w:val="en-US"/>
+              </w:rPr>
+              <w:t>.: (3463) 200-800</w:t>
             </w:r>
           </w:p>
           <w:p>
-            <w:r>
-              <w:t>E-</w:t>
-            </w:r>
-            <w:proofErr w:type="spellStart"/>
-            <w:r>
-              <w:t>mail</w:t>
-            </w:r>
-            <w:proofErr w:type="spellEnd"/>
-            <w:r>
-              <w:t>: office@e-yugansk.ru</w:t>
+            <w:pPr>
+              <w:rPr>
+                <w:lang w:val="en-US"/>
+              </w:rPr>
+            </w:pPr>
+            <w:r>
+              <w:rPr>
+                <w:lang w:val="en-US"/>
+              </w:rPr>
+              <w:t>E-mail: office@e-yugansk.ru</w:t>
             </w:r>
           </w:p>
           <w:p>
@@ -1220,91 +1383,227 @@
             </w:tcBorders>
             <w:shd w:val="clear" w:color="auto" w:fill="auto"/>
           </w:tcPr>
-          <w:p/>
           <w:p>
             <w:pPr>
-              <w:pBdr>
-                <w:top w:val="single" w:sz="12" w:space="1" w:color="auto"/>
-                <w:bottom w:val="single" w:sz="12" w:space="1" w:color="auto"/>
-              </w:pBdr>
+              <w:rPr>
+                <w:rFonts w:ascii="Segoe UI" w:hAnsi="Segoe UI" w:cs="Segoe UI"/>
+                <w:color w:val="0F1115"/>
+                <w:sz w:val="23"/>
+                <w:szCs w:val="23"/>
+                <w:shd w:val="clear" w:color="auto" w:fill="FFFFFF"/>
+              </w:rPr>
+            </w:pPr>
+            <w:r>
+              <w:rPr>
+                <w:rFonts w:ascii="Segoe UI" w:hAnsi="Segoe UI" w:cs="Segoe UI"/>
+                <w:color w:val="0F1115"/>
+                <w:sz w:val="23"/>
+                <w:szCs w:val="23"/>
+                <w:shd w:val="clear" w:color="auto" w:fill="FFFFFF"/>
+              </w:rPr>
+              <w:t>{</w:t>
+            </w:r>
+            <w:proofErr w:type="spellStart"/>
+            <w:r>
+              <w:rPr>
+                <w:rFonts w:ascii="Segoe UI" w:hAnsi="Segoe UI" w:cs="Segoe UI"/>
+                <w:color w:val="0F1115"/>
+                <w:sz w:val="23"/>
+                <w:szCs w:val="23"/>
+                <w:shd w:val="clear" w:color="auto" w:fill="FFFFFF"/>
+              </w:rPr>
+              <w:t>full_name</w:t>
+            </w:r>
+            <w:proofErr w:type="spellEnd"/>
+            <w:r>
+              <w:rPr>
+                <w:rFonts w:ascii="Segoe UI" w:hAnsi="Segoe UI" w:cs="Segoe UI"/>
+                <w:color w:val="0F1115"/>
+                <w:sz w:val="23"/>
+                <w:szCs w:val="23"/>
+                <w:shd w:val="clear" w:color="auto" w:fill="FFFFFF"/>
+              </w:rPr>
+              <w:t>}</w:t>
+            </w:r>
+          </w:p>
+          <w:p>
+            <w:pPr>
+              <w:pStyle w:val="HTML"/>
+              <w:wordWrap w:val="0"/>
+              <w:spacing w:line="330" w:lineRule="atLeast"/>
+              <w:rPr>
+                <w:rFonts w:ascii="Consolas" w:hAnsi="Consolas"/>
+                <w:color w:val="0F1115"/>
+              </w:rPr>
+            </w:pPr>
+            <w:r>
+              <w:rPr>
+                <w:rFonts w:ascii="Consolas" w:hAnsi="Consolas"/>
+                <w:color w:val="0F1115"/>
+              </w:rPr>
+              <w:t>Телефон: {</w:t>
+            </w:r>
+            <w:proofErr w:type="spellStart"/>
+            <w:r>
+              <w:rPr>
+                <w:rFonts w:ascii="Consolas" w:hAnsi="Consolas"/>
+                <w:color w:val="0F1115"/>
+              </w:rPr>
+              <w:t>phone</w:t>
+            </w:r>
+            <w:proofErr w:type="spellEnd"/>
+            <w:r>
+              <w:rPr>
+                <w:rFonts w:ascii="Consolas" w:hAnsi="Consolas"/>
+                <w:color w:val="0F1115"/>
+              </w:rPr>
+              <w:t>}</w:t>
+            </w:r>
+          </w:p>
+          <w:p>
+            <w:pPr>
+              <w:pStyle w:val="HTML"/>
+              <w:wordWrap w:val="0"/>
+              <w:spacing w:line="330" w:lineRule="atLeast"/>
+              <w:rPr>
+                <w:rFonts w:ascii="Consolas" w:hAnsi="Consolas"/>
+                <w:color w:val="0F1115"/>
+              </w:rPr>
+            </w:pPr>
+            <w:r>
+              <w:rPr>
+                <w:rFonts w:ascii="Consolas" w:hAnsi="Consolas"/>
+                <w:color w:val="0F1115"/>
+              </w:rPr>
+              <w:t>Адрес проживания: {</w:t>
+            </w:r>
+            <w:proofErr w:type="spellStart"/>
+            <w:r>
+              <w:rPr>
+                <w:rFonts w:ascii="Consolas" w:hAnsi="Consolas"/>
+                <w:color w:val="0F1115"/>
+              </w:rPr>
+              <w:t>full_address</w:t>
+            </w:r>
+            <w:proofErr w:type="spellEnd"/>
+            <w:r>
+              <w:rPr>
+                <w:rFonts w:ascii="Consolas" w:hAnsi="Consolas"/>
+                <w:color w:val="0F1115"/>
+              </w:rPr>
+              <w:t>}</w:t>
+            </w:r>
+          </w:p>
+          <w:p>
+            <w:pPr>
+              <w:pStyle w:val="HTML"/>
+              <w:wordWrap w:val="0"/>
+              <w:spacing w:line="330" w:lineRule="atLeast"/>
+              <w:rPr>
+                <w:rFonts w:ascii="Consolas" w:hAnsi="Consolas"/>
+                <w:color w:val="0F1115"/>
+              </w:rPr>
             </w:pPr>
           </w:p>
           <w:p>
             <w:pPr>
-              <w:pBdr>
-                <w:bottom w:val="single" w:sz="12" w:space="1" w:color="auto"/>
-                <w:between w:val="single" w:sz="12" w:space="1" w:color="auto"/>
-              </w:pBdr>
-              <w:jc w:val="center"/>
-              <w:rPr>
-                <w:b/>
-                <w:bCs/>
+              <w:pStyle w:val="HTML"/>
+              <w:wordWrap w:val="0"/>
+              <w:spacing w:line="330" w:lineRule="atLeast"/>
+              <w:rPr>
+                <w:rFonts w:ascii="Consolas" w:hAnsi="Consolas"/>
+                <w:color w:val="0F1115"/>
               </w:rPr>
             </w:pPr>
+            <w:r>
+              <w:rPr>
+                <w:rFonts w:ascii="Consolas" w:hAnsi="Consolas"/>
+                <w:color w:val="0F1115"/>
+              </w:rPr>
+              <w:t>Паспорт: ___________________</w:t>
+            </w:r>
+            <w:r>
+              <w:rPr>
+                <w:rFonts w:ascii="Consolas" w:hAnsi="Consolas"/>
+                <w:color w:val="0F1115"/>
+              </w:rPr>
+              <w:t>_______________</w:t>
+            </w:r>
           </w:p>
           <w:p>
             <w:pPr>
-              <w:pBdr>
-                <w:bottom w:val="single" w:sz="12" w:space="1" w:color="auto"/>
-                <w:between w:val="single" w:sz="12" w:space="1" w:color="auto"/>
-              </w:pBdr>
-              <w:jc w:val="center"/>
-              <w:rPr>
-                <w:b/>
-                <w:bCs/>
+              <w:pStyle w:val="HTML"/>
+              <w:wordWrap w:val="0"/>
+              <w:spacing w:line="330" w:lineRule="atLeast"/>
+              <w:rPr>
+                <w:rFonts w:ascii="Consolas" w:hAnsi="Consolas"/>
+                <w:color w:val="0F1115"/>
               </w:rPr>
             </w:pPr>
+            <w:r>
+              <w:rPr>
+                <w:rFonts w:ascii="Consolas" w:hAnsi="Consolas"/>
+                <w:color w:val="0F1115"/>
+              </w:rPr>
+              <w:t>____________________________________________</w:t>
+            </w:r>
           </w:p>
           <w:p>
             <w:pPr>
-              <w:pBdr>
-                <w:bottom w:val="single" w:sz="12" w:space="1" w:color="auto"/>
-                <w:between w:val="single" w:sz="12" w:space="1" w:color="auto"/>
-              </w:pBdr>
+              <w:pStyle w:val="HTML"/>
+              <w:wordWrap w:val="0"/>
+              <w:spacing w:line="330" w:lineRule="atLeast"/>
+              <w:rPr>
+                <w:rFonts w:ascii="Consolas" w:hAnsi="Consolas"/>
+                <w:color w:val="0F1115"/>
+              </w:rPr>
             </w:pPr>
+            <w:r>
+              <w:rPr>
+                <w:rFonts w:ascii="Consolas" w:hAnsi="Consolas"/>
+                <w:color w:val="0F1115"/>
+              </w:rPr>
+              <w:t>_____________________________________________</w:t>
+            </w:r>
           </w:p>
           <w:p>
             <w:pPr>
-              <w:pBdr>
-                <w:bottom w:val="single" w:sz="12" w:space="1" w:color="auto"/>
-                <w:between w:val="single" w:sz="12" w:space="1" w:color="auto"/>
-              </w:pBdr>
+              <w:pStyle w:val="HTML"/>
+              <w:wordWrap w:val="0"/>
+              <w:spacing w:line="330" w:lineRule="atLeast"/>
+              <w:rPr>
+                <w:rFonts w:ascii="Consolas" w:hAnsi="Consolas"/>
+                <w:color w:val="0F1115"/>
+              </w:rPr>
             </w:pPr>
+            <w:r>
+              <w:rPr>
+                <w:rFonts w:ascii="Consolas" w:hAnsi="Consolas"/>
+                <w:color w:val="0F1115"/>
+              </w:rPr>
+              <w:t>_____________________________________________</w:t>
+            </w:r>
           </w:p>
           <w:p>
             <w:pPr>
-              <w:pBdr>
-                <w:bottom w:val="single" w:sz="12" w:space="1" w:color="auto"/>
-                <w:between w:val="single" w:sz="12" w:space="1" w:color="auto"/>
-              </w:pBdr>
+              <w:pStyle w:val="HTML"/>
+              <w:wordWrap w:val="0"/>
+              <w:spacing w:line="330" w:lineRule="atLeast"/>
+              <w:rPr>
+                <w:rFonts w:ascii="Consolas" w:hAnsi="Consolas"/>
+                <w:color w:val="0F1115"/>
+              </w:rPr>
             </w:pPr>
+            <w:r>
+              <w:rPr>
+                <w:rFonts w:ascii="Consolas" w:hAnsi="Consolas"/>
+                <w:color w:val="0F1115"/>
+              </w:rPr>
+              <w:t>(серия, номер, кем и когда выдан)</w:t>
+            </w:r>
           </w:p>
           <w:p>
             <w:pPr>
-              <w:pBdr>
-                <w:bottom w:val="single" w:sz="12" w:space="1" w:color="auto"/>
-                <w:between w:val="single" w:sz="12" w:space="1" w:color="auto"/>
-              </w:pBdr>
-            </w:pPr>
-          </w:p>
-          <w:p>
-            <w:pPr>
-              <w:pBdr>
-                <w:bottom w:val="single" w:sz="12" w:space="1" w:color="auto"/>
-                <w:between w:val="single" w:sz="12" w:space="1" w:color="auto"/>
-              </w:pBdr>
-            </w:pPr>
-          </w:p>
-          <w:p>
-            <w:pPr>
-              <w:pBdr>
-                <w:bottom w:val="single" w:sz="12" w:space="1" w:color="auto"/>
-                <w:between w:val="single" w:sz="12" w:space="1" w:color="auto"/>
-              </w:pBdr>
-            </w:pPr>
-          </w:p>
-          <w:p>
-            <w:pPr>
               <w:rPr>
                 <w:b/>
                 <w:bCs/>
@@ -1312,6 +1611,8 @@
             </w:pPr>
           </w:p>
         </w:tc>
+        <w:bookmarkStart w:id="0" w:name="_GoBack"/>
+        <w:bookmarkEnd w:id="0"/>
       </w:tr>
       <w:tr>
         <w:tc>
@@ -1652,6 +1953,51 @@
     <w:lsdException w:name="Subtitle" w:qFormat="1"/>
     <w:lsdException w:name="Strong" w:qFormat="1"/>
     <w:lsdException w:name="Emphasis" w:qFormat="1"/>
+    <w:lsdException w:name="HTML Preformatted" w:uiPriority="99"/>
+    <w:lsdException w:name="Normal Table" w:semiHidden="1" w:unhideWhenUsed="1"/>
+    <w:lsdException w:name="Table Simple 1" w:semiHidden="1" w:unhideWhenUsed="1"/>
+    <w:lsdException w:name="Table Simple 2" w:semiHidden="1" w:unhideWhenUsed="1"/>
+    <w:lsdException w:name="Table Simple 3" w:semiHidden="1" w:unhideWhenUsed="1"/>
+    <w:lsdException w:name="Table Classic 1" w:semiHidden="1" w:unhideWhenUsed="1"/>
+    <w:lsdException w:name="Table Classic 2" w:semiHidden="1" w:unhideWhenUsed="1"/>
+    <w:lsdException w:name="Table Classic 3" w:semiHidden="1" w:unhideWhenUsed="1"/>
+    <w:lsdException w:name="Table Classic 4" w:semiHidden="1" w:unhideWhenUsed="1"/>
+    <w:lsdException w:name="Table Colorful 1" w:semiHidden="1" w:unhideWhenUsed="1"/>
+    <w:lsdException w:name="Table Colorful 2" w:semiHidden="1" w:unhideWhenUsed="1"/>
+    <w:lsdException w:name="Table Colorful 3" w:semiHidden="1" w:unhideWhenUsed="1"/>
+    <w:lsdException w:name="Table Columns 1" w:semiHidden="1" w:unhideWhenUsed="1"/>
+    <w:lsdException w:name="Table Columns 2" w:semiHidden="1" w:unhideWhenUsed="1"/>
+    <w:lsdException w:name="Table Columns 3" w:semiHidden="1" w:unhideWhenUsed="1"/>
+    <w:lsdException w:name="Table Columns 4" w:semiHidden="1" w:unhideWhenUsed="1"/>
+    <w:lsdException w:name="Table Columns 5" w:semiHidden="1" w:unhideWhenUsed="1"/>
+    <w:lsdException w:name="Table Grid 1" w:semiHidden="1" w:unhideWhenUsed="1"/>
+    <w:lsdException w:name="Table Grid 2" w:semiHidden="1" w:unhideWhenUsed="1"/>
+    <w:lsdException w:name="Table Grid 3" w:semiHidden="1" w:unhideWhenUsed="1"/>
+    <w:lsdException w:name="Table Grid 4" w:semiHidden="1" w:unhideWhenUsed="1"/>
+    <w:lsdException w:name="Table Grid 5" w:semiHidden="1" w:unhideWhenUsed="1"/>
+    <w:lsdException w:name="Table Grid 6" w:semiHidden="1" w:unhideWhenUsed="1"/>
+    <w:lsdException w:name="Table Grid 7" w:semiHidden="1" w:unhideWhenUsed="1"/>
+    <w:lsdException w:name="Table Grid 8" w:semiHidden="1" w:unhideWhenUsed="1"/>
+    <w:lsdException w:name="Table List 1" w:semiHidden="1" w:unhideWhenUsed="1"/>
+    <w:lsdException w:name="Table List 2" w:semiHidden="1" w:unhideWhenUsed="1"/>
+    <w:lsdException w:name="Table List 3" w:semiHidden="1" w:unhideWhenUsed="1"/>
+    <w:lsdException w:name="Table List 4" w:semiHidden="1" w:unhideWhenUsed="1"/>
+    <w:lsdException w:name="Table List 5" w:semiHidden="1" w:unhideWhenUsed="1"/>
+    <w:lsdException w:name="Table List 6" w:semiHidden="1" w:unhideWhenUsed="1"/>
+    <w:lsdException w:name="Table List 7" w:semiHidden="1" w:unhideWhenUsed="1"/>
+    <w:lsdException w:name="Table List 8" w:semiHidden="1" w:unhideWhenUsed="1"/>
+    <w:lsdException w:name="Table 3D effects 1" w:semiHidden="1" w:unhideWhenUsed="1"/>
+    <w:lsdException w:name="Table 3D effects 2" w:semiHidden="1" w:unhideWhenUsed="1"/>
+    <w:lsdException w:name="Table 3D effects 3" w:semiHidden="1" w:unhideWhenUsed="1"/>
+    <w:lsdException w:name="Table Contemporary" w:semiHidden="1" w:unhideWhenUsed="1"/>
+    <w:lsdException w:name="Table Elegant" w:semiHidden="1" w:unhideWhenUsed="1"/>
+    <w:lsdException w:name="Table Professional" w:semiHidden="1" w:unhideWhenUsed="1"/>
+    <w:lsdException w:name="Table Subtle 1" w:semiHidden="1" w:unhideWhenUsed="1"/>
+    <w:lsdException w:name="Table Subtle 2" w:semiHidden="1" w:unhideWhenUsed="1"/>
+    <w:lsdException w:name="Table Web 1" w:semiHidden="1" w:unhideWhenUsed="1"/>
+    <w:lsdException w:name="Table Web 2" w:semiHidden="1" w:unhideWhenUsed="1"/>
+    <w:lsdException w:name="Table Web 3" w:semiHidden="1" w:unhideWhenUsed="1"/>
+    <w:lsdException w:name="Table Theme" w:semiHidden="1" w:unhideWhenUsed="1"/>
     <w:lsdException w:name="Placeholder Text" w:semiHidden="1" w:uiPriority="99"/>
     <w:lsdException w:name="No Spacing" w:uiPriority="1" w:qFormat="1"/>
     <w:lsdException w:name="Light Shading" w:uiPriority="60"/>
@@ -1883,11 +2229,15 @@
   </w:style>
   <w:style w:type="character" w:default="1" w:styleId="a0">
     <w:name w:val="Default Paragraph Font"/>
+    <w:uiPriority w:val="1"/>
     <w:semiHidden/>
+    <w:unhideWhenUsed/>
   </w:style>
   <w:style w:type="table" w:default="1" w:styleId="a1">
     <w:name w:val="Normal Table"/>
+    <w:uiPriority w:val="99"/>
     <w:semiHidden/>
+    <w:unhideWhenUsed/>
     <w:tblPr>
       <w:tblInd w:w="0" w:type="dxa"/>
       <w:tblCellMar>
@@ -1900,7 +2250,9 @@
   </w:style>
   <w:style w:type="numbering" w:default="1" w:styleId="a2">
     <w:name w:val="No List"/>
+    <w:uiPriority w:val="99"/>
     <w:semiHidden/>
+    <w:unhideWhenUsed/>
   </w:style>
   <w:style w:type="paragraph" w:styleId="a3">
     <w:name w:val="Balloon Text"/>
@@ -1927,6 +2279,49 @@
         <w:insideV w:val="single" w:sz="4" w:space="0" w:color="auto"/>
       </w:tblBorders>
     </w:tblPr>
+  </w:style>
+  <w:style w:type="paragraph" w:styleId="HTML">
+    <w:name w:val="HTML Preformatted"/>
+    <w:basedOn w:val="a"/>
+    <w:link w:val="HTML0"/>
+    <w:uiPriority w:val="99"/>
+    <w:unhideWhenUsed/>
+    <w:rsid w:val="00DE7620"/>
+    <w:pPr>
+      <w:tabs>
+        <w:tab w:val="left" w:pos="916"/>
+        <w:tab w:val="left" w:pos="1832"/>
+        <w:tab w:val="left" w:pos="2748"/>
+        <w:tab w:val="left" w:pos="3664"/>
+        <w:tab w:val="left" w:pos="4580"/>
+        <w:tab w:val="left" w:pos="5496"/>
+        <w:tab w:val="left" w:pos="6412"/>
+        <w:tab w:val="left" w:pos="7328"/>
+        <w:tab w:val="left" w:pos="8244"/>
+        <w:tab w:val="left" w:pos="9160"/>
+        <w:tab w:val="left" w:pos="10076"/>
+        <w:tab w:val="left" w:pos="10992"/>
+        <w:tab w:val="left" w:pos="11908"/>
+        <w:tab w:val="left" w:pos="12824"/>
+        <w:tab w:val="left" w:pos="13740"/>
+        <w:tab w:val="left" w:pos="14656"/>
+      </w:tabs>
+    </w:pPr>
+    <w:rPr>
+      <w:rFonts w:ascii="Courier New" w:hAnsi="Courier New" w:cs="Courier New"/>
+      <w:sz w:val="20"/>
+      <w:szCs w:val="20"/>
+    </w:rPr>
+  </w:style>
+  <w:style w:type="character" w:customStyle="1" w:styleId="HTML0">
+    <w:name w:val="Стандартный HTML Знак"/>
+    <w:basedOn w:val="a0"/>
+    <w:link w:val="HTML"/>
+    <w:uiPriority w:val="99"/>
+    <w:rsid w:val="00DE7620"/>
+    <w:rPr>
+      <w:rFonts w:ascii="Courier New" w:hAnsi="Courier New" w:cs="Courier New"/>
+    </w:rPr>
   </w:style>
 </w:styles>
 </file>

</xml_diff>

<commit_message>
Hide installation clause if tube not installed
</commit_message>
<xml_diff>
--- a/contract_template.docx
+++ b/contract_template.docx
@@ -231,13 +231,7 @@
       </w:r>
       <w:proofErr w:type="spellEnd"/>
       <w:r>
-        <w:t>}</w:t>
-      </w:r>
-      <w:r>
-        <w:t xml:space="preserve">, </w:t>
-      </w:r>
-      <w:r>
-        <w:t>кв. № {</w:t>
+        <w:t>}, кв. № {</w:t>
       </w:r>
       <w:proofErr w:type="spellStart"/>
       <w:r>
@@ -365,7 +359,18 @@
           <w:szCs w:val="23"/>
           <w:shd w:val="clear" w:color="auto" w:fill="FFFFFF"/>
         </w:rPr>
-        <w:t xml:space="preserve">}» </w:t>
+        <w:t>}» г</w:t>
+      </w:r>
+      <w:r>
+        <w:t>.</w:t>
+      </w:r>
+      <w:r>
+        <w:t xml:space="preserve">               </w:t>
+      </w:r>
+    </w:p>
+    <w:p>
+      <w:r>
+        <w:t xml:space="preserve">       </w:t>
       </w:r>
       <w:r>
         <w:rPr>
@@ -375,19 +380,9 @@
           <w:szCs w:val="23"/>
           <w:shd w:val="clear" w:color="auto" w:fill="FFFFFF"/>
         </w:rPr>
-        <w:t>г</w:t>
-      </w:r>
-      <w:r>
-        <w:t>.</w:t>
-      </w:r>
-      <w:r>
-        <w:t xml:space="preserve">               </w:t>
-      </w:r>
-    </w:p>
-    <w:p>
-      <w:r>
-        <w:t xml:space="preserve">       </w:t>
-      </w:r>
+        <w:t>по «{</w:t>
+      </w:r>
+      <w:proofErr w:type="spellStart"/>
       <w:r>
         <w:rPr>
           <w:rFonts w:ascii="Segoe UI" w:hAnsi="Segoe UI" w:cs="Segoe UI"/>
@@ -396,9 +391,9 @@
           <w:szCs w:val="23"/>
           <w:shd w:val="clear" w:color="auto" w:fill="FFFFFF"/>
         </w:rPr>
-        <w:t>по «{</w:t>
-      </w:r>
-      <w:proofErr w:type="spellStart"/>
+        <w:t>end_date</w:t>
+      </w:r>
+      <w:proofErr w:type="spellEnd"/>
       <w:r>
         <w:rPr>
           <w:rFonts w:ascii="Segoe UI" w:hAnsi="Segoe UI" w:cs="Segoe UI"/>
@@ -407,9 +402,81 @@
           <w:szCs w:val="23"/>
           <w:shd w:val="clear" w:color="auto" w:fill="FFFFFF"/>
         </w:rPr>
-        <w:t>end_date</w:t>
-      </w:r>
-      <w:proofErr w:type="spellEnd"/>
+        <w:t>}» г.</w:t>
+      </w:r>
+    </w:p>
+    <w:p>
+      <w:r>
+        <w:t xml:space="preserve">2.2. По истечении срока, указанного в п.2.1., с согласия обеих сторон, договор продлевается </w:t>
+      </w:r>
+      <w:r>
+        <w:t xml:space="preserve"> </w:t>
+      </w:r>
+    </w:p>
+    <w:p>
+      <w:r>
+        <w:t xml:space="preserve">       </w:t>
+      </w:r>
+      <w:r>
+        <w:t>автоматически.</w:t>
+      </w:r>
+    </w:p>
+    <w:p>
+      <w:r>
+        <w:t xml:space="preserve">2.3. Договор может быть расторгнут досрочно по инициативе одной из сторон с уведомлением </w:t>
+      </w:r>
+      <w:r>
+        <w:t xml:space="preserve"> </w:t>
+      </w:r>
+    </w:p>
+    <w:p>
+      <w:r>
+        <w:t xml:space="preserve">       </w:t>
+      </w:r>
+      <w:r>
+        <w:t xml:space="preserve">другой стороны не позднее чем за один месяц до даты расторжения, при этом должны быть </w:t>
+      </w:r>
+    </w:p>
+    <w:p>
+      <w:r>
+        <w:t xml:space="preserve">       </w:t>
+      </w:r>
+      <w:r>
+        <w:t>решены все финансовые вопросы, вытекающие из настоящего договора.</w:t>
+      </w:r>
+    </w:p>
+    <w:p/>
+    <w:p>
+      <w:pPr>
+        <w:numPr>
+          <w:ilvl w:val="0"/>
+          <w:numId w:val="2"/>
+        </w:numPr>
+        <w:jc w:val="center"/>
+        <w:rPr>
+          <w:b/>
+        </w:rPr>
+      </w:pPr>
+      <w:r>
+        <w:rPr>
+          <w:b/>
+        </w:rPr>
+        <w:t>Стоимость и порядок расчетов.</w:t>
+      </w:r>
+    </w:p>
+    <w:p>
+      <w:r>
+        <w:t xml:space="preserve">3.1. Плата за обслуживание </w:t>
+      </w:r>
+      <w:r>
+        <w:t xml:space="preserve">линии до АУ </w:t>
+      </w:r>
+      <w:r>
+        <w:t>составляет с одной квартиры</w:t>
+      </w:r>
+      <w:r>
+        <w:t xml:space="preserve"> </w:t>
+      </w:r>
       <w:r>
         <w:rPr>
           <w:rFonts w:ascii="Segoe UI" w:hAnsi="Segoe UI" w:cs="Segoe UI"/>
@@ -418,81 +485,9 @@
           <w:szCs w:val="23"/>
           <w:shd w:val="clear" w:color="auto" w:fill="FFFFFF"/>
         </w:rPr>
-        <w:t>}» г.</w:t>
-      </w:r>
-    </w:p>
-    <w:p>
-      <w:r>
-        <w:t xml:space="preserve">2.2. По истечении срока, указанного в п.2.1., с согласия обеих сторон, договор продлевается </w:t>
-      </w:r>
-      <w:r>
-        <w:t xml:space="preserve"> </w:t>
-      </w:r>
-    </w:p>
-    <w:p>
-      <w:r>
-        <w:t xml:space="preserve">       </w:t>
-      </w:r>
-      <w:r>
-        <w:t>автоматически.</w:t>
-      </w:r>
-    </w:p>
-    <w:p>
-      <w:r>
-        <w:t xml:space="preserve">2.3. Договор может быть расторгнут досрочно по инициативе одной из сторон с уведомлением </w:t>
-      </w:r>
-      <w:r>
-        <w:t xml:space="preserve"> </w:t>
-      </w:r>
-    </w:p>
-    <w:p>
-      <w:r>
-        <w:t xml:space="preserve">       </w:t>
-      </w:r>
-      <w:r>
-        <w:t xml:space="preserve">другой стороны не позднее чем за один месяц до даты расторжения, при этом должны быть </w:t>
-      </w:r>
-    </w:p>
-    <w:p>
-      <w:r>
-        <w:t xml:space="preserve">       </w:t>
-      </w:r>
-      <w:r>
-        <w:t>решены все финансовые вопросы, вытекающие из настоящего договора.</w:t>
-      </w:r>
-    </w:p>
-    <w:p/>
-    <w:p>
-      <w:pPr>
-        <w:numPr>
-          <w:ilvl w:val="0"/>
-          <w:numId w:val="2"/>
-        </w:numPr>
-        <w:jc w:val="center"/>
-        <w:rPr>
-          <w:b/>
-        </w:rPr>
-      </w:pPr>
-      <w:r>
-        <w:rPr>
-          <w:b/>
-        </w:rPr>
-        <w:t>Стоимость и порядок расчетов.</w:t>
-      </w:r>
-    </w:p>
-    <w:p>
-      <w:r>
-        <w:t xml:space="preserve">3.1. Плата за обслуживание </w:t>
-      </w:r>
-      <w:r>
-        <w:t xml:space="preserve">линии до АУ </w:t>
-      </w:r>
-      <w:r>
-        <w:t>составляет с одной квартиры</w:t>
-      </w:r>
-      <w:r>
-        <w:t xml:space="preserve"> </w:t>
-      </w:r>
+        <w:t>{</w:t>
+      </w:r>
+      <w:proofErr w:type="spellStart"/>
       <w:r>
         <w:rPr>
           <w:rFonts w:ascii="Segoe UI" w:hAnsi="Segoe UI" w:cs="Segoe UI"/>
@@ -501,9 +496,9 @@
           <w:szCs w:val="23"/>
           <w:shd w:val="clear" w:color="auto" w:fill="FFFFFF"/>
         </w:rPr>
-        <w:t>{</w:t>
-      </w:r>
-      <w:proofErr w:type="spellStart"/>
+        <w:t>amount</w:t>
+      </w:r>
+      <w:proofErr w:type="spellEnd"/>
       <w:r>
         <w:rPr>
           <w:rFonts w:ascii="Segoe UI" w:hAnsi="Segoe UI" w:cs="Segoe UI"/>
@@ -512,9 +507,14 @@
           <w:szCs w:val="23"/>
           <w:shd w:val="clear" w:color="auto" w:fill="FFFFFF"/>
         </w:rPr>
-        <w:t>amount</w:t>
-      </w:r>
-      <w:proofErr w:type="spellEnd"/>
+        <w:t>}</w:t>
+      </w:r>
+      <w:r>
+        <w:rPr>
+          <w:u w:val="single"/>
+        </w:rPr>
+        <w:t xml:space="preserve"> </w:t>
+      </w:r>
       <w:r>
         <w:rPr>
           <w:rFonts w:ascii="Segoe UI" w:hAnsi="Segoe UI" w:cs="Segoe UI"/>
@@ -523,14 +523,9 @@
           <w:szCs w:val="23"/>
           <w:shd w:val="clear" w:color="auto" w:fill="FFFFFF"/>
         </w:rPr>
-        <w:t>}</w:t>
-      </w:r>
-      <w:r>
-        <w:rPr>
-          <w:u w:val="single"/>
-        </w:rPr>
-        <w:t xml:space="preserve"> </w:t>
-      </w:r>
+        <w:t>{</w:t>
+      </w:r>
+      <w:proofErr w:type="spellStart"/>
       <w:r>
         <w:rPr>
           <w:rFonts w:ascii="Segoe UI" w:hAnsi="Segoe UI" w:cs="Segoe UI"/>
@@ -539,9 +534,9 @@
           <w:szCs w:val="23"/>
           <w:shd w:val="clear" w:color="auto" w:fill="FFFFFF"/>
         </w:rPr>
-        <w:t>{</w:t>
-      </w:r>
-      <w:proofErr w:type="spellStart"/>
+        <w:t>amount_text</w:t>
+      </w:r>
+      <w:proofErr w:type="spellEnd"/>
       <w:r>
         <w:rPr>
           <w:rFonts w:ascii="Segoe UI" w:hAnsi="Segoe UI" w:cs="Segoe UI"/>
@@ -550,87 +545,70 @@
           <w:szCs w:val="23"/>
           <w:shd w:val="clear" w:color="auto" w:fill="FFFFFF"/>
         </w:rPr>
-        <w:t>amount_text</w:t>
+        <w:t xml:space="preserve">} </w:t>
+      </w:r>
+      <w:r>
+        <w:rPr>
+          <w:u w:val="single"/>
+        </w:rPr>
+        <w:t>рублей</w:t>
+      </w:r>
+      <w:r>
+        <w:rPr>
+          <w:u w:val="single"/>
+        </w:rPr>
+        <w:t xml:space="preserve"> 00 коп</w:t>
+      </w:r>
+      <w:r>
+        <w:rPr>
+          <w:u w:val="single"/>
+        </w:rPr>
+        <w:t xml:space="preserve"> в </w:t>
+      </w:r>
+      <w:r>
+        <w:rPr>
+          <w:u w:val="single"/>
+        </w:rPr>
+        <w:t>год.</w:t>
+      </w:r>
+    </w:p>
+    <w:p>
+      <w:pPr>
+        <w:pStyle w:val="HTML"/>
+        <w:wordWrap w:val="0"/>
+        <w:spacing w:line="330" w:lineRule="atLeast"/>
+        <w:rPr>
+          <w:rFonts w:ascii="Consolas" w:hAnsi="Consolas"/>
+          <w:color w:val="0F1115"/>
+        </w:rPr>
+      </w:pPr>
+      <w:r>
+        <w:rPr>
+          <w:rFonts w:ascii="Consolas" w:hAnsi="Consolas"/>
+          <w:color w:val="0F1115"/>
+        </w:rPr>
+        <w:t>{</w:t>
+      </w:r>
+      <w:proofErr w:type="spellStart"/>
+      <w:r>
+        <w:rPr>
+          <w:rFonts w:ascii="Consolas" w:hAnsi="Consolas"/>
+          <w:color w:val="0F1115"/>
+        </w:rPr>
+        <w:t>installation_clause</w:t>
       </w:r>
       <w:proofErr w:type="spellEnd"/>
       <w:r>
         <w:rPr>
-          <w:rFonts w:ascii="Segoe UI" w:hAnsi="Segoe UI" w:cs="Segoe UI"/>
+          <w:rFonts w:ascii="Consolas" w:hAnsi="Consolas"/>
           <w:color w:val="0F1115"/>
-          <w:sz w:val="23"/>
-          <w:szCs w:val="23"/>
-          <w:shd w:val="clear" w:color="auto" w:fill="FFFFFF"/>
         </w:rPr>
         <w:t>}</w:t>
       </w:r>
-      <w:r>
-        <w:rPr>
-          <w:rFonts w:ascii="Segoe UI" w:hAnsi="Segoe UI" w:cs="Segoe UI"/>
-          <w:color w:val="0F1115"/>
-          <w:sz w:val="23"/>
-          <w:szCs w:val="23"/>
-          <w:shd w:val="clear" w:color="auto" w:fill="FFFFFF"/>
-        </w:rPr>
-        <w:t xml:space="preserve"> </w:t>
-      </w:r>
-      <w:r>
-        <w:rPr>
-          <w:u w:val="single"/>
-        </w:rPr>
-        <w:t>рублей</w:t>
-      </w:r>
-      <w:r>
-        <w:rPr>
-          <w:u w:val="single"/>
-        </w:rPr>
-        <w:t xml:space="preserve"> 00 коп</w:t>
-      </w:r>
-      <w:r>
-        <w:rPr>
-          <w:u w:val="single"/>
-        </w:rPr>
-        <w:t xml:space="preserve"> в </w:t>
-      </w:r>
-      <w:r>
-        <w:rPr>
-          <w:u w:val="single"/>
-        </w:rPr>
-        <w:t>год.</w:t>
-      </w:r>
-    </w:p>
-    <w:p>
-      <w:r>
-        <w:t xml:space="preserve">3.2 Плата за монтаж </w:t>
-      </w:r>
-      <w:r>
-        <w:t>абонентского устройства (АУ)</w:t>
-      </w:r>
-      <w:r>
-        <w:t xml:space="preserve"> составляет с одной квартиры</w:t>
-      </w:r>
-      <w:r>
-        <w:t>,</w:t>
-      </w:r>
-      <w:r>
-        <w:t xml:space="preserve"> </w:t>
-      </w:r>
-      <w:r>
-        <w:rPr>
-          <w:u w:val="single"/>
-        </w:rPr>
-        <w:t>3000 (три тысячи) рублей</w:t>
-      </w:r>
-      <w:r>
-        <w:rPr>
-          <w:u w:val="single"/>
-        </w:rPr>
-        <w:t xml:space="preserve"> 00 коп</w:t>
-      </w:r>
-      <w:r>
-        <w:t>.</w:t>
-      </w:r>
-    </w:p>
-    <w:p>
+    </w:p>
+    <w:p>
+      <w:bookmarkStart w:id="0" w:name="_GoBack"/>
+      <w:bookmarkEnd w:id="0"/>
       <w:r>
         <w:t>3.</w:t>
       </w:r>
@@ -1520,14 +1498,7 @@
                 <w:rFonts w:ascii="Consolas" w:hAnsi="Consolas"/>
                 <w:color w:val="0F1115"/>
               </w:rPr>
-              <w:t>Паспорт: ___________________</w:t>
-            </w:r>
-            <w:r>
-              <w:rPr>
-                <w:rFonts w:ascii="Consolas" w:hAnsi="Consolas"/>
-                <w:color w:val="0F1115"/>
-              </w:rPr>
-              <w:t>_______________</w:t>
+              <w:t>Паспорт: __________________________________</w:t>
             </w:r>
           </w:p>
           <w:p>
@@ -1611,8 +1582,6 @@
             </w:pPr>
           </w:p>
         </w:tc>
-        <w:bookmarkStart w:id="0" w:name="_GoBack"/>
-        <w:bookmarkEnd w:id="0"/>
       </w:tr>
       <w:tr>
         <w:tc>

</xml_diff>

<commit_message>
Hide installation clause if tube not installed3
</commit_message>
<xml_diff>
--- a/contract_template.docx
+++ b/contract_template.docx
@@ -578,78 +578,85 @@
         <w:wordWrap w:val="0"/>
         <w:spacing w:line="330" w:lineRule="atLeast"/>
         <w:rPr>
-          <w:rFonts w:ascii="Consolas" w:hAnsi="Consolas"/>
-          <w:color w:val="0F1115"/>
-        </w:rPr>
-      </w:pPr>
-      <w:r>
-        <w:rPr>
-          <w:rFonts w:ascii="Consolas" w:hAnsi="Consolas"/>
-          <w:color w:val="0F1115"/>
+          <w:rFonts w:ascii="Times New Roman" w:hAnsi="Times New Roman" w:cs="Times New Roman"/>
+          <w:sz w:val="24"/>
+          <w:szCs w:val="24"/>
+        </w:rPr>
+      </w:pPr>
+      <w:r>
+        <w:rPr>
+          <w:rFonts w:ascii="Times New Roman" w:hAnsi="Times New Roman" w:cs="Times New Roman"/>
+          <w:sz w:val="24"/>
+          <w:szCs w:val="24"/>
         </w:rPr>
         <w:t>{</w:t>
       </w:r>
       <w:proofErr w:type="spellStart"/>
       <w:r>
         <w:rPr>
-          <w:rFonts w:ascii="Consolas" w:hAnsi="Consolas"/>
-          <w:color w:val="0F1115"/>
+          <w:rFonts w:ascii="Times New Roman" w:hAnsi="Times New Roman" w:cs="Times New Roman"/>
+          <w:sz w:val="24"/>
+          <w:szCs w:val="24"/>
         </w:rPr>
         <w:t>installation_clause</w:t>
       </w:r>
       <w:proofErr w:type="spellEnd"/>
       <w:r>
         <w:rPr>
-          <w:rFonts w:ascii="Consolas" w:hAnsi="Consolas"/>
-          <w:color w:val="0F1115"/>
+          <w:rFonts w:ascii="Times New Roman" w:hAnsi="Times New Roman" w:cs="Times New Roman"/>
+          <w:sz w:val="24"/>
+          <w:szCs w:val="24"/>
         </w:rPr>
         <w:t>}</w:t>
       </w:r>
     </w:p>
     <w:p>
+      <w:r>
+        <w:t>3.</w:t>
+      </w:r>
+      <w:r>
+        <w:t>3</w:t>
+      </w:r>
+      <w:r>
+        <w:t xml:space="preserve">. Плата за обслуживание может изменяться в зависимости от уровня инфляции, о чем </w:t>
+      </w:r>
+    </w:p>
+    <w:p>
+      <w:r>
+        <w:t xml:space="preserve">       </w:t>
+      </w:r>
+      <w:r>
+        <w:t>«Заказчик» должен быть предупрежден не менее чем за один месяц.</w:t>
+      </w:r>
+    </w:p>
+    <w:p>
+      <w:r>
+        <w:t>3.4.</w:t>
+      </w:r>
+      <w:r>
+        <w:t xml:space="preserve"> Исполнитель применяет упрощённую систему налогообложения, поэтому стоимость работ, указанная в пункте</w:t>
+      </w:r>
+      <w:r>
+        <w:t xml:space="preserve"> 3.1</w:t>
+      </w:r>
+      <w:r>
+        <w:t xml:space="preserve"> настоящего Договора, НДС не облагается на основании п. 2 ст. 346.11 Налогового кодекса Р</w:t>
+      </w:r>
+      <w:r>
+        <w:t>Ф.</w:t>
+      </w:r>
+    </w:p>
+    <w:p>
+      <w:r>
+        <w:t>3.5 В</w:t>
+      </w:r>
+      <w:r>
+        <w:t xml:space="preserve"> случае изменения системы налогоо</w:t>
+      </w:r>
       <w:bookmarkStart w:id="0" w:name="_GoBack"/>
       <w:bookmarkEnd w:id="0"/>
       <w:r>
-        <w:t>3.</w:t>
-      </w:r>
-      <w:r>
-        <w:t>3</w:t>
-      </w:r>
-      <w:r>
-        <w:t xml:space="preserve">. Плата за обслуживание может изменяться в зависимости от уровня инфляции, о чем </w:t>
-      </w:r>
-    </w:p>
-    <w:p>
-      <w:r>
-        <w:t xml:space="preserve">       </w:t>
-      </w:r>
-      <w:r>
-        <w:t>«Заказчик» должен быть предупрежден не менее чем за один месяц.</w:t>
-      </w:r>
-    </w:p>
-    <w:p>
-      <w:r>
-        <w:t>3.4.</w:t>
-      </w:r>
-      <w:r>
-        <w:t xml:space="preserve"> Исполнитель применяет упрощённую систему налогообложения, поэтому стоимость работ, указанная в пункте</w:t>
-      </w:r>
-      <w:r>
-        <w:t xml:space="preserve"> 3.1</w:t>
-      </w:r>
-      <w:r>
-        <w:t xml:space="preserve"> настоящего Договора, НДС не облагается на основании п. 2 ст. 346.11 Налогового кодекса Р</w:t>
-      </w:r>
-      <w:r>
-        <w:t>Ф.</w:t>
-      </w:r>
-    </w:p>
-    <w:p>
-      <w:r>
-        <w:t>3.5 В</w:t>
-      </w:r>
-      <w:r>
-        <w:t xml:space="preserve"> случае изменения системы налогообложения Исполнителя и возникновения у него обязанности по уплате НДС, стоимость работ (услуг) по настоящему Договору увеличивается на сумму НДС в соответствии с законодательством РФ. Увеличение цены происходит с момента, когда Исполнитель стал плательщиком НДС</w:t>
+        <w:t>бложения Исполнителя и возникновения у него обязанности по уплате НДС, стоимость работ (услуг) по настоящему Договору увеличивается на сумму НДС в соответствии с законодательством РФ. Увеличение цены происходит с момента, когда Исполнитель стал плательщиком НДС</w:t>
       </w:r>
       <w:r>
         <w:t>.</w:t>

</xml_diff>

<commit_message>
Fix: keep placeholder in template, handle numbering correctly1
</commit_message>
<xml_diff>
--- a/contract_template.docx
+++ b/contract_template.docx
@@ -67,16 +67,14 @@
         <w:jc w:val="center"/>
         <w:rPr>
           <w:b/>
-        </w:rPr>
-      </w:pPr>
-    </w:p>
-    <w:p>
-      <w:pPr>
-        <w:jc w:val="center"/>
+          <w:bCs/>
+        </w:rPr>
       </w:pPr>
       <w:r>
         <w:rPr>
           <w:rFonts w:ascii="Segoe UI" w:hAnsi="Segoe UI" w:cs="Segoe UI"/>
+          <w:b/>
+          <w:bCs/>
           <w:color w:val="0F1115"/>
           <w:sz w:val="23"/>
           <w:szCs w:val="23"/>
@@ -85,16 +83,35 @@
         <w:t xml:space="preserve">от </w:t>
       </w:r>
       <w:r>
+        <w:rPr>
+          <w:b/>
+          <w:bCs/>
+        </w:rPr>
         <w:t>«{</w:t>
       </w:r>
       <w:proofErr w:type="spellStart"/>
       <w:r>
+        <w:rPr>
+          <w:b/>
+          <w:bCs/>
+        </w:rPr>
         <w:t>current_date</w:t>
       </w:r>
       <w:proofErr w:type="spellEnd"/>
       <w:r>
+        <w:rPr>
+          <w:b/>
+          <w:bCs/>
+        </w:rPr>
         <w:t>}» г.</w:t>
       </w:r>
+      <w:bookmarkStart w:id="0" w:name="_GoBack"/>
+      <w:bookmarkEnd w:id="0"/>
+    </w:p>
+    <w:p>
+      <w:pPr>
+        <w:jc w:val="center"/>
+      </w:pPr>
     </w:p>
     <w:p>
       <w:r>
@@ -1626,10 +1643,7 @@
             </w:r>
           </w:p>
           <w:p/>
-          <w:p>
-            <w:bookmarkStart w:id="0" w:name="_GoBack"/>
-            <w:bookmarkEnd w:id="0"/>
-          </w:p>
+          <w:p/>
           <w:p>
             <w:r>
               <w:t xml:space="preserve">____________________________ </w:t>

</xml_diff>